<commit_message>
Fill five-college UG/PG folders to 7 samples where found.
Keep original 论坛纷纭 texts. Add sourced extras into 学院名本科部 / 学院名研究生部 (max 7). GSTI undergraduate stays short because there is no regular bachelor programme. Refresh the first-person remainder workbook.

Co-authored-by: 36613453226Wallen <36613453226Wallen@users.noreply.github.com>
</commit_message>
<xml_diff>
--- a/files/论坛纷纭/五院论坛观感粗评分.docx
+++ b/files/论坛纷纭/五院论坛观感粗评分.docx
@@ -394,7 +394,7 @@
           <w:color w:val="1F4E79"/>
           <w:sz w:val="26"/>
         </w:rPr>
-        <w:t>英语学院　本科 7.2　·　研究生部 5.8　·　本夹取样 8 条</w:t>
+        <w:t>英语学院　本科 7.2　·　研究生部 5.8　·　本夹取样 14 条</w:t>
       </w:r>
     </w:p>
     <w:p>
@@ -410,7 +410,7 @@
           <w:color w:val="212529"/>
           <w:sz w:val="22"/>
         </w:rPr>
-        <w:t>本科有实名 Insight 长帖和豆瓣「幸存者偏差」，课表、peer pressure、2016 课改都能对上，所以本科分明显高于研究生部。硕士侧几乎全是 611/811 考研机构文，缺宿舍、导师、seminar。Reddit/贴吧/小红书/微博/X 没有抓到可引用的英院对口帖。</w:t>
+        <w:t>本科有实名 Insight 长帖和豆瓣「幸存者偏差」，课表、peer pressure、2016 课改都能对上，所以本科分明显高于研究生部。硕士侧仍以 611/811 复试回忆为主；续搜补了英美文学网面题和美国研究三跨帖，还是没有 seminar 日记。Reddit/贴吧/小红书/微博/X 没有抓到可引用的英院对口帖。</w:t>
       </w:r>
     </w:p>
     <w:p>
@@ -425,7 +425,7 @@
           <w:color w:val="1F4E79"/>
           <w:sz w:val="26"/>
         </w:rPr>
-        <w:t>俄语学院　本科 6.0　·　研究生部 5.5　·　本夹取样 7 条</w:t>
+        <w:t>俄语学院　本科 6.0　·　研究生部 5.5　·　本夹取样 14 条</w:t>
       </w:r>
     </w:p>
     <w:p>
@@ -441,7 +441,7 @@
           <w:color w:val="212529"/>
           <w:sz w:val="22"/>
         </w:rPr>
-        <w:t>本科有 Whever 两篇知乎，情绪极强但信息短；豆瓣小语种辩护不能直接算俄语就业。研究生部 2018 俄语 MTI 复试帖是五院里少见的「进考场」第一人称。新祥旭「就业率 100%」按下限权重。出国培训部俄语预科未计入，避免和统招俄院混。</w:t>
+        <w:t>本科有 Whever 两篇知乎，情绪极强但信息短；续搜只补到课表转载和院长转述校友，普通在读仍缺。研究生部 2016/2018 俄语口译复试帖是五院里少见的「进考场」第一人称。新祥旭「就业率 100%」按下限权重。出国培训部俄语预科未计入，避免和统招俄院混。</w:t>
       </w:r>
     </w:p>
     <w:p>
@@ -456,7 +456,7 @@
           <w:color w:val="1F4E79"/>
           <w:sz w:val="26"/>
         </w:rPr>
-        <w:t>高级翻译学院　本科 2.5　·　研究生部 7.0　·　本夹取样 8 条</w:t>
+        <w:t>高级翻译学院　本科 2.5　·　研究生部 7.0　·　本夹取样 10 条</w:t>
       </w:r>
     </w:p>
     <w:p>
@@ -472,7 +472,7 @@
           <w:color w:val="212529"/>
           <w:sz w:val="22"/>
         </w:rPr>
-        <w:t>本科分低不是学院差，是公开检索几乎没有「高翻本科就读」——学院以研究生为主，本科只表现为保研入口。研究生部反而最硬：学院就业调查（纯口译 4.23%）、李长栓谈作业、尚姝辰求职、考研论坛一战分数。扣分点：kaoyan 旧帖被新站导航吞掉；辅导站把同传入门写成殿堂。</w:t>
+        <w:t>本科分低不是学院差，是公开检索几乎没有「高翻本科就读」——学院以研究生为主，本科只表现为保研入口。研究生部反而最硬：学院就业调查（纯口译 4.23%）、李长栓谈作业、张旭复语班作业否决项、考研论坛一战分数。扣分点：kaoyan 旧帖被新站导航吞掉；辅导站把同传入门写成殿堂。</w:t>
       </w:r>
     </w:p>
     <w:p>
@@ -487,7 +487,7 @@
           <w:color w:val="1F4E79"/>
           <w:sz w:val="26"/>
         </w:rPr>
-        <w:t>国际商学院　本科 5.0　·　研究生部 6.8　·　本夹取样 9 条</w:t>
+        <w:t>国际商学院　本科 5.0　·　研究生部 6.8　·　本夹取样 14 条</w:t>
       </w:r>
     </w:p>
     <w:p>
@@ -503,7 +503,7 @@
           <w:color w:val="212529"/>
           <w:sz w:val="22"/>
         </w:rPr>
-        <w:t>统招本科第一人称少，曹渊、lu-llaby66 是 2016 年经管之家，之后断层。金融专硕经验帖成束（科目、群面/单面、CFA、英文试卷），所以研究生部高于本科。Reddit 只点名 MIB/入学数学，没有课堂。2+2/EAP 官网感言单独取样并降权，防止把留学项目当成高考国商。</w:t>
+        <w:t>统招本科第一人称少，曹渊、lu-llaby66 是 2016 年经管之家；续搜补了倪子君学霸稿和 EAP 项目，降权。金融专硕 / MIB 经验帖成束（科目、群面/单面、CFA、免修英语传闻），所以研究生部高于本科。Reddit 只点名 MIB/入学数学，没有课堂。2+2/EAP 官网感言单独取样并降权，防止把留学项目当成高考国商。</w:t>
       </w:r>
     </w:p>
     <w:p>
@@ -518,7 +518,7 @@
           <w:color w:val="1F4E79"/>
           <w:sz w:val="26"/>
         </w:rPr>
-        <w:t>国际关系学院　本科 6.3　·　研究生部 5.7　·　本夹取样 8 条</w:t>
+        <w:t>国际关系学院　本科 6.3　·　研究生部 5.7　·　本夹取样 14 条</w:t>
       </w:r>
     </w:p>
     <w:p>
@@ -534,7 +534,7 @@
           <w:color w:val="212529"/>
           <w:sz w:val="22"/>
         </w:rPr>
-        <w:t>本科有中青报实习清单，也有转载贴说「课空泛、就业不全靠外交知识」，加上 Whever「国关养老」，三方对不上，信息反而全。研究生部有 2011 级国奖回忆和外交学/国际经济复试口述，但新材料几乎全在北鼎。填志愿楼把北外、外交学院、国际关系学院（大学）搅在一起，评分时已分开。</w:t>
+        <w:t>本科有中青报实习清单，也有转载贴说「课空泛」，加上官方双学位/专八口径和 Whever「国关养老」，三方对不上。研究生部有 2011 级国奖回忆和外交学复试口述；续搜同一人另一帖，独立叙述者没有增加。填志愿楼把北外、外交学院、国际关系学院（大学）搅在一起，评分时已分开。</w:t>
       </w:r>
     </w:p>
     <w:p>

</xml_diff>